<commit_message>
Simplify Oct. 28 PD teacher planning sheet
Replace the detailed reflection form with a simple one-page quick planning sheet with four large open writing areas for the task, student routine, colleague idea, and next step/evidence check.
</commit_message>
<xml_diff>
--- a/assets/plc/2026-10-28_PD_Science_Literacy_Reflection_and_Next_Steps.docx
+++ b/assets/plc/2026-10-28_PD_Science_Literacy_Reflection_and_Next_Steps.docx
@@ -17,15 +17,15 @@
           <w:tcPr>
             <w:tcW w:type="dxa" w:w="10425"/>
             <w:tcMar>
-              <w:top w:w="70" w:type="dxa"/>
-              <w:start w:w="90" w:type="dxa"/>
-              <w:bottom w:w="70" w:type="dxa"/>
-              <w:end w:w="90" w:type="dxa"/>
+              <w:top w:w="75" w:type="dxa"/>
+              <w:start w:w="100" w:type="dxa"/>
+              <w:bottom w:w="75" w:type="dxa"/>
+              <w:end w:w="100" w:type="dxa"/>
             </w:tcMar>
             <w:vAlign w:val="top"/>
             <w:shd w:fill="1F2933"/>
             <w:tcBorders>
-              <w:bottom w:val="single" w:sz="12" w:color="B31B34"/>
+              <w:bottom w:val="single" w:sz="13" w:color="B31B34"/>
             </w:tcBorders>
           </w:tcPr>
           <w:p>
@@ -36,6 +36,7 @@
               <w:rPr>
                 <w:rFonts w:ascii="Aptos" w:hAnsi="Aptos" w:eastAsia="Aptos"/>
                 <w:b/>
+                <w:i w:val="0"/>
                 <w:color w:val="F4B7BC"/>
                 <w:sz w:val="14"/>
               </w:rPr>
@@ -50,10 +51,11 @@
               <w:rPr>
                 <w:rFonts w:ascii="Aptos" w:hAnsi="Aptos" w:eastAsia="Aptos"/>
                 <w:b/>
+                <w:i w:val="0"/>
                 <w:color w:val="FFFFFF"/>
-                <w:sz w:val="30"/>
+                <w:sz w:val="31"/>
               </w:rPr>
-              <w:t>Science Literacy PD Reflection, Collaboration &amp; Next Steps</w:t>
+              <w:t>Science Literacy PD | Quick Planning Sheet</w:t>
             </w:r>
           </w:p>
           <w:p>
@@ -64,6 +66,7 @@
               <w:rPr>
                 <w:rFonts w:ascii="Aptos" w:hAnsi="Aptos" w:eastAsia="Aptos"/>
                 <w:b w:val="0"/>
+                <w:i w:val="0"/>
                 <w:color w:val="FFFFFF"/>
                 <w:sz w:val="16"/>
               </w:rPr>
@@ -75,7 +78,7 @@
     </w:tbl>
     <w:p>
       <w:pPr>
-        <w:spacing w:before="0" w:after="60"/>
+        <w:spacing w:before="0" w:after="80"/>
       </w:pPr>
     </w:p>
     <w:tbl>
@@ -95,10 +98,10 @@
           <w:tcPr>
             <w:tcW w:type="dxa" w:w="3671"/>
             <w:tcMar>
-              <w:top w:w="70" w:type="dxa"/>
-              <w:start w:w="90" w:type="dxa"/>
-              <w:bottom w:w="70" w:type="dxa"/>
-              <w:end w:w="90" w:type="dxa"/>
+              <w:top w:w="75" w:type="dxa"/>
+              <w:start w:w="100" w:type="dxa"/>
+              <w:bottom w:w="75" w:type="dxa"/>
+              <w:end w:w="100" w:type="dxa"/>
             </w:tcMar>
             <w:vAlign w:val="top"/>
             <w:tcBorders>
@@ -113,6 +116,7 @@
               <w:rPr>
                 <w:rFonts w:ascii="Aptos" w:hAnsi="Aptos" w:eastAsia="Aptos"/>
                 <w:b/>
+                <w:i w:val="0"/>
                 <w:color w:val="1F2933"/>
                 <w:sz w:val="16"/>
               </w:rPr>
@@ -124,10 +128,10 @@
           <w:tcPr>
             <w:tcW w:type="dxa" w:w="3096"/>
             <w:tcMar>
-              <w:top w:w="70" w:type="dxa"/>
-              <w:start w:w="90" w:type="dxa"/>
-              <w:bottom w:w="70" w:type="dxa"/>
-              <w:end w:w="90" w:type="dxa"/>
+              <w:top w:w="75" w:type="dxa"/>
+              <w:start w:w="100" w:type="dxa"/>
+              <w:bottom w:w="75" w:type="dxa"/>
+              <w:end w:w="100" w:type="dxa"/>
             </w:tcMar>
             <w:vAlign w:val="top"/>
             <w:tcBorders>
@@ -142,6 +146,7 @@
               <w:rPr>
                 <w:rFonts w:ascii="Aptos" w:hAnsi="Aptos" w:eastAsia="Aptos"/>
                 <w:b/>
+                <w:i w:val="0"/>
                 <w:color w:val="1F2933"/>
                 <w:sz w:val="16"/>
               </w:rPr>
@@ -153,10 +158,10 @@
           <w:tcPr>
             <w:tcW w:type="dxa" w:w="3657"/>
             <w:tcMar>
-              <w:top w:w="70" w:type="dxa"/>
-              <w:start w:w="90" w:type="dxa"/>
-              <w:bottom w:w="70" w:type="dxa"/>
-              <w:end w:w="90" w:type="dxa"/>
+              <w:top w:w="75" w:type="dxa"/>
+              <w:start w:w="100" w:type="dxa"/>
+              <w:bottom w:w="75" w:type="dxa"/>
+              <w:end w:w="100" w:type="dxa"/>
             </w:tcMar>
             <w:vAlign w:val="top"/>
             <w:tcBorders>
@@ -171,6 +176,7 @@
               <w:rPr>
                 <w:rFonts w:ascii="Aptos" w:hAnsi="Aptos" w:eastAsia="Aptos"/>
                 <w:b/>
+                <w:i w:val="0"/>
                 <w:color w:val="1F2933"/>
                 <w:sz w:val="16"/>
               </w:rPr>
@@ -182,30 +188,32 @@
     </w:tbl>
     <w:p>
       <w:pPr>
-        <w:spacing w:before="0" w:after="80"/>
+        <w:spacing w:before="0" w:after="100"/>
       </w:pPr>
     </w:p>
     <w:p>
       <w:pPr>
-        <w:spacing w:before="0" w:after="120"/>
+        <w:spacing w:before="0" w:after="140"/>
       </w:pPr>
       <w:r>
         <w:rPr>
           <w:rFonts w:ascii="Aptos" w:hAnsi="Aptos" w:eastAsia="Aptos"/>
           <w:b/>
+          <w:i w:val="0"/>
           <w:color w:val="B31B34"/>
           <w:sz w:val="15"/>
         </w:rPr>
-        <w:t xml:space="preserve">HOW TO USE THIS SHEET  </w:t>
+        <w:t xml:space="preserve">USE THIS PAGE TO CAPTURE ONE IDEA YOU WILL TRY. </w:t>
       </w:r>
       <w:r>
         <w:rPr>
           <w:rFonts w:ascii="Aptos" w:hAnsi="Aptos" w:eastAsia="Aptos"/>
           <w:b w:val="0"/>
+          <w:i w:val="0"/>
           <w:color w:val="1F2933"/>
           <w:sz w:val="16"/>
         </w:rPr>
-        <w:t>Complete Sections 1–3 during PD using Every Day Questions 1, 3, and 4 and Team Deep Dive Steps 2–4. Complete Section 4 during the closing and after PD to capture colleague ideas, a next step, and evidence to bring Friday.</w:t>
+        <w:t>Short notes are enough; use open space for anything useful.</w:t>
       </w:r>
     </w:p>
     <w:tbl>
@@ -223,13 +231,12 @@
           <w:tcPr>
             <w:tcW w:type="dxa" w:w="10425"/>
             <w:tcMar>
-              <w:top w:w="70" w:type="dxa"/>
-              <w:start w:w="90" w:type="dxa"/>
-              <w:bottom w:w="70" w:type="dxa"/>
-              <w:end w:w="90" w:type="dxa"/>
+              <w:top w:w="75" w:type="dxa"/>
+              <w:start w:w="100" w:type="dxa"/>
+              <w:bottom w:w="75" w:type="dxa"/>
+              <w:end w:w="100" w:type="dxa"/>
             </w:tcMar>
             <w:vAlign w:val="top"/>
-            <w:shd w:fill="FFFFFF"/>
             <w:tcBorders>
               <w:bottom w:val="single" w:sz="10" w:color="1F2933"/>
             </w:tcBorders>
@@ -242,8 +249,9 @@
               <w:rPr>
                 <w:rFonts w:ascii="Aptos" w:hAnsi="Aptos" w:eastAsia="Aptos"/>
                 <w:b/>
+                <w:i w:val="0"/>
                 <w:color w:val="B31B34"/>
-                <w:sz w:val="20"/>
+                <w:sz w:val="21"/>
               </w:rPr>
               <w:t xml:space="preserve">1  </w:t>
             </w:r>
@@ -251,26 +259,27 @@
               <w:rPr>
                 <w:rFonts w:ascii="Aptos" w:hAnsi="Aptos" w:eastAsia="Aptos"/>
                 <w:b/>
+                <w:i w:val="0"/>
                 <w:color w:val="1F2933"/>
-                <w:sz w:val="17"/>
+                <w:sz w:val="19"/>
               </w:rPr>
-              <w:t>DURING PD — LESSON PURPOSE, SOURCE, AND MASTERY BAR</w:t>
+              <w:t>MY SCIENCE SOURCE OR WRITING TASK</w:t>
             </w:r>
           </w:p>
         </w:tc>
       </w:tr>
       <w:tr>
         <w:trPr>
-          <w:trHeight w:val="1944" w:hRule="atLeast"/>
+          <w:trHeight w:val="1843" w:hRule="atLeast"/>
         </w:trPr>
         <w:tc>
           <w:tcPr>
             <w:tcW w:type="dxa" w:w="10425"/>
             <w:tcMar>
-              <w:top w:w="70" w:type="dxa"/>
-              <w:start w:w="90" w:type="dxa"/>
-              <w:bottom w:w="70" w:type="dxa"/>
-              <w:end w:w="90" w:type="dxa"/>
+              <w:top w:w="75" w:type="dxa"/>
+              <w:start w:w="100" w:type="dxa"/>
+              <w:bottom w:w="75" w:type="dxa"/>
+              <w:end w:w="100" w:type="dxa"/>
             </w:tcMar>
             <w:vAlign w:val="top"/>
             <w:tcBorders>
@@ -279,16 +288,17 @@
           </w:tcPr>
           <w:p>
             <w:pPr>
-              <w:spacing w:before="0" w:after="40" w:line="240" w:lineRule="auto"/>
+              <w:spacing w:before="0" w:after="20" w:line="240" w:lineRule="auto"/>
             </w:pPr>
             <w:r>
               <w:rPr>
                 <w:rFonts w:ascii="Aptos" w:hAnsi="Aptos" w:eastAsia="Aptos"/>
                 <w:b w:val="0"/>
+                <w:i/>
                 <w:color w:val="6B7280"/>
-                <w:sz w:val="15"/>
+                <w:sz w:val="16"/>
               </w:rPr>
-              <w:t>Lesson Internalization Tool: Every Day Question 1 / Team Deep Dive Step 2. What source or task will students analyze? What must be visible in the response?  Source type:  article/text  •  graph/data  •  diagram/model  •  investigation result  •  other</w:t>
+              <w:t>What will students analyze, explain, or revise?</w:t>
             </w:r>
           </w:p>
         </w:tc>
@@ -296,7 +306,7 @@
     </w:tbl>
     <w:p>
       <w:pPr>
-        <w:spacing w:before="0" w:after="100"/>
+        <w:spacing w:before="0" w:after="140"/>
       </w:pPr>
     </w:p>
     <w:tbl>
@@ -314,13 +324,12 @@
           <w:tcPr>
             <w:tcW w:type="dxa" w:w="10425"/>
             <w:tcMar>
-              <w:top w:w="70" w:type="dxa"/>
-              <w:start w:w="90" w:type="dxa"/>
-              <w:bottom w:w="70" w:type="dxa"/>
-              <w:end w:w="90" w:type="dxa"/>
+              <w:top w:w="75" w:type="dxa"/>
+              <w:start w:w="100" w:type="dxa"/>
+              <w:bottom w:w="75" w:type="dxa"/>
+              <w:end w:w="100" w:type="dxa"/>
             </w:tcMar>
             <w:vAlign w:val="top"/>
-            <w:shd w:fill="FFFFFF"/>
             <w:tcBorders>
               <w:bottom w:val="single" w:sz="10" w:color="1F2933"/>
             </w:tcBorders>
@@ -333,8 +342,9 @@
               <w:rPr>
                 <w:rFonts w:ascii="Aptos" w:hAnsi="Aptos" w:eastAsia="Aptos"/>
                 <w:b/>
+                <w:i w:val="0"/>
                 <w:color w:val="B31B34"/>
-                <w:sz w:val="20"/>
+                <w:sz w:val="21"/>
               </w:rPr>
               <w:t xml:space="preserve">2  </w:t>
             </w:r>
@@ -342,26 +352,27 @@
               <w:rPr>
                 <w:rFonts w:ascii="Aptos" w:hAnsi="Aptos" w:eastAsia="Aptos"/>
                 <w:b/>
+                <w:i w:val="0"/>
                 <w:color w:val="1F2933"/>
-                <w:sz w:val="17"/>
+                <w:sz w:val="19"/>
               </w:rPr>
-              <w:t>DURING PD — CUBS, COLOR-CODED CER, AND FACILITATION</w:t>
+              <w:t>MY STUDENT ROUTINE</w:t>
             </w:r>
           </w:p>
         </w:tc>
       </w:tr>
       <w:tr>
         <w:trPr>
-          <w:trHeight w:val="1944" w:hRule="atLeast"/>
+          <w:trHeight w:val="2232" w:hRule="atLeast"/>
         </w:trPr>
         <w:tc>
           <w:tcPr>
             <w:tcW w:type="dxa" w:w="10425"/>
             <w:tcMar>
-              <w:top w:w="70" w:type="dxa"/>
-              <w:start w:w="90" w:type="dxa"/>
-              <w:bottom w:w="70" w:type="dxa"/>
-              <w:end w:w="90" w:type="dxa"/>
+              <w:top w:w="75" w:type="dxa"/>
+              <w:start w:w="100" w:type="dxa"/>
+              <w:bottom w:w="75" w:type="dxa"/>
+              <w:end w:w="100" w:type="dxa"/>
             </w:tcMar>
             <w:vAlign w:val="top"/>
             <w:tcBorders>
@@ -370,16 +381,32 @@
           </w:tcPr>
           <w:p>
             <w:pPr>
-              <w:spacing w:before="0" w:after="40" w:line="240" w:lineRule="auto"/>
+              <w:spacing w:before="0" w:after="80" w:line="240" w:lineRule="auto"/>
+            </w:pPr>
+            <w:r>
+              <w:rPr>
+                <w:rFonts w:ascii="Aptos" w:hAnsi="Aptos" w:eastAsia="Aptos"/>
+                <w:b/>
+                <w:i w:val="0"/>
+                <w:color w:val="1F2933"/>
+                <w:sz w:val="16"/>
+              </w:rPr>
+              <w:t>Check one or more:   ☐ CUBS source analysis     ☐ Color-coded CER     ☐ Feedback + revision</w:t>
+            </w:r>
+          </w:p>
+          <w:p>
+            <w:pPr>
+              <w:spacing w:before="0" w:after="0" w:line="240" w:lineRule="auto"/>
             </w:pPr>
             <w:r>
               <w:rPr>
                 <w:rFonts w:ascii="Aptos" w:hAnsi="Aptos" w:eastAsia="Aptos"/>
                 <w:b w:val="0"/>
+                <w:i/>
                 <w:color w:val="6B7280"/>
-                <w:sz w:val="15"/>
+                <w:sz w:val="16"/>
               </w:rPr>
-              <w:t>Lesson Internalization Tool: Every Day Questions 3–4 / Team Deep Dive Steps 3–4. What will students circle, underline, box, and summarize? What will students color-code in CER? What will be productive, partial, or mistaken? What question or support will preserve the thinking?</w:t>
+              <w:t>What will students do, say, or produce?</w:t>
             </w:r>
           </w:p>
         </w:tc>
@@ -387,7 +414,7 @@
     </w:tbl>
     <w:p>
       <w:pPr>
-        <w:spacing w:before="0" w:after="100"/>
+        <w:spacing w:before="0" w:after="140"/>
       </w:pPr>
     </w:p>
     <w:tbl>
@@ -405,13 +432,12 @@
           <w:tcPr>
             <w:tcW w:type="dxa" w:w="10425"/>
             <w:tcMar>
-              <w:top w:w="70" w:type="dxa"/>
-              <w:start w:w="90" w:type="dxa"/>
-              <w:bottom w:w="70" w:type="dxa"/>
-              <w:end w:w="90" w:type="dxa"/>
+              <w:top w:w="75" w:type="dxa"/>
+              <w:start w:w="100" w:type="dxa"/>
+              <w:bottom w:w="75" w:type="dxa"/>
+              <w:end w:w="100" w:type="dxa"/>
             </w:tcMar>
             <w:vAlign w:val="top"/>
-            <w:shd w:fill="FFFFFF"/>
             <w:tcBorders>
               <w:bottom w:val="single" w:sz="10" w:color="1F2933"/>
             </w:tcBorders>
@@ -424,8 +450,9 @@
               <w:rPr>
                 <w:rFonts w:ascii="Aptos" w:hAnsi="Aptos" w:eastAsia="Aptos"/>
                 <w:b/>
+                <w:i w:val="0"/>
                 <w:color w:val="B31B34"/>
-                <w:sz w:val="20"/>
+                <w:sz w:val="21"/>
               </w:rPr>
               <w:t xml:space="preserve">3  </w:t>
             </w:r>
@@ -433,26 +460,27 @@
               <w:rPr>
                 <w:rFonts w:ascii="Aptos" w:hAnsi="Aptos" w:eastAsia="Aptos"/>
                 <w:b/>
+                <w:i w:val="0"/>
                 <w:color w:val="1F2933"/>
-                <w:sz w:val="17"/>
+                <w:sz w:val="19"/>
               </w:rPr>
-              <w:t>DURING PD — WRITING-SAMPLE FEEDBACK, REVISION, AND EVIDENCE</w:t>
+              <w:t>ONE USEFUL IDEA FROM A COLLEAGUE</w:t>
             </w:r>
           </w:p>
         </w:tc>
       </w:tr>
       <w:tr>
         <w:trPr>
-          <w:trHeight w:val="1944" w:hRule="atLeast"/>
+          <w:trHeight w:val="1756" w:hRule="atLeast"/>
         </w:trPr>
         <w:tc>
           <w:tcPr>
             <w:tcW w:type="dxa" w:w="10425"/>
             <w:tcMar>
-              <w:top w:w="70" w:type="dxa"/>
-              <w:start w:w="90" w:type="dxa"/>
-              <w:bottom w:w="70" w:type="dxa"/>
-              <w:end w:w="90" w:type="dxa"/>
+              <w:top w:w="75" w:type="dxa"/>
+              <w:start w:w="100" w:type="dxa"/>
+              <w:bottom w:w="75" w:type="dxa"/>
+              <w:end w:w="100" w:type="dxa"/>
             </w:tcMar>
             <w:vAlign w:val="top"/>
             <w:tcBorders>
@@ -461,16 +489,17 @@
           </w:tcPr>
           <w:p>
             <w:pPr>
-              <w:spacing w:before="0" w:after="40" w:line="240" w:lineRule="auto"/>
+              <w:spacing w:before="0" w:after="20" w:line="240" w:lineRule="auto"/>
             </w:pPr>
             <w:r>
               <w:rPr>
                 <w:rFonts w:ascii="Aptos" w:hAnsi="Aptos" w:eastAsia="Aptos"/>
                 <w:b w:val="0"/>
+                <w:i/>
                 <w:color w:val="6B7280"/>
-                <w:sz w:val="15"/>
+                <w:sz w:val="16"/>
               </w:rPr>
-              <w:t>Use 1–2 de-identified writing samples. What is visible, partial, or missing in the explanation? What feedback prompt and revision action will students use? What evidence will show progress toward the standard?</w:t>
+              <w:t>A strategy, sentence stem, question, or routine that could work in my course:</w:t>
             </w:r>
           </w:p>
         </w:tc>
@@ -478,7 +507,7 @@
     </w:tbl>
     <w:p>
       <w:pPr>
-        <w:spacing w:before="0" w:after="100"/>
+        <w:spacing w:before="0" w:after="140"/>
       </w:pPr>
     </w:p>
     <w:tbl>
@@ -496,13 +525,12 @@
           <w:tcPr>
             <w:tcW w:type="dxa" w:w="10425"/>
             <w:tcMar>
-              <w:top w:w="70" w:type="dxa"/>
-              <w:start w:w="90" w:type="dxa"/>
-              <w:bottom w:w="70" w:type="dxa"/>
-              <w:end w:w="90" w:type="dxa"/>
+              <w:top w:w="75" w:type="dxa"/>
+              <w:start w:w="100" w:type="dxa"/>
+              <w:bottom w:w="75" w:type="dxa"/>
+              <w:end w:w="100" w:type="dxa"/>
             </w:tcMar>
             <w:vAlign w:val="top"/>
-            <w:shd w:fill="FFFFFF"/>
             <w:tcBorders>
               <w:bottom w:val="single" w:sz="10" w:color="1F2933"/>
             </w:tcBorders>
@@ -515,8 +543,9 @@
               <w:rPr>
                 <w:rFonts w:ascii="Aptos" w:hAnsi="Aptos" w:eastAsia="Aptos"/>
                 <w:b/>
+                <w:i w:val="0"/>
                 <w:color w:val="B31B34"/>
-                <w:sz w:val="20"/>
+                <w:sz w:val="21"/>
               </w:rPr>
               <w:t xml:space="preserve">4  </w:t>
             </w:r>
@@ -524,26 +553,27 @@
               <w:rPr>
                 <w:rFonts w:ascii="Aptos" w:hAnsi="Aptos" w:eastAsia="Aptos"/>
                 <w:b/>
+                <w:i w:val="0"/>
                 <w:color w:val="1F2933"/>
-                <w:sz w:val="17"/>
+                <w:sz w:val="19"/>
               </w:rPr>
-              <w:t>DURING THE CLOSING AND AFTER PD — COLLEAGUE IDEAS AND NEXT STEPS</w:t>
+              <w:t>MY NEXT STEP AND EVIDENCE CHECK</w:t>
             </w:r>
           </w:p>
         </w:tc>
       </w:tr>
       <w:tr>
         <w:trPr>
-          <w:trHeight w:val="2592" w:hRule="atLeast"/>
+          <w:trHeight w:val="1987" w:hRule="atLeast"/>
         </w:trPr>
         <w:tc>
           <w:tcPr>
             <w:tcW w:type="dxa" w:w="10425"/>
             <w:tcMar>
-              <w:top w:w="70" w:type="dxa"/>
-              <w:start w:w="90" w:type="dxa"/>
-              <w:bottom w:w="70" w:type="dxa"/>
-              <w:end w:w="90" w:type="dxa"/>
+              <w:top w:w="75" w:type="dxa"/>
+              <w:start w:w="100" w:type="dxa"/>
+              <w:bottom w:w="75" w:type="dxa"/>
+              <w:end w:w="100" w:type="dxa"/>
             </w:tcMar>
             <w:vAlign w:val="top"/>
             <w:tcBorders>
@@ -552,20 +582,17 @@
           </w:tcPr>
           <w:p>
             <w:pPr>
-              <w:spacing w:before="0" w:after="40" w:line="240" w:lineRule="auto"/>
+              <w:spacing w:before="0" w:after="20" w:line="240" w:lineRule="auto"/>
             </w:pPr>
             <w:r>
               <w:rPr>
                 <w:rFonts w:ascii="Aptos" w:hAnsi="Aptos" w:eastAsia="Aptos"/>
                 <w:b w:val="0"/>
+                <w:i/>
                 <w:color w:val="6B7280"/>
-                <w:sz w:val="15"/>
+                <w:sz w:val="16"/>
               </w:rPr>
-              <w:t>One useful CUBS or color-coded CER strategy shared by a colleague:  ______________________________________</w:t>
-              <w:br/>
-              <w:t>My next step before teaching:  ______________________________________    Evidence I will collect or bring Friday:  ______________________________________</w:t>
-              <w:br/>
-              <w:t>Question or support still needed:  ______________________________________</w:t>
+              <w:t>Before teaching, I will…  |  On Friday, I want to see or bring evidence of…</w:t>
             </w:r>
           </w:p>
         </w:tc>
@@ -594,10 +621,11 @@
       <w:rPr>
         <w:rFonts w:ascii="Aptos" w:hAnsi="Aptos" w:eastAsia="Aptos"/>
         <w:b/>
+        <w:i w:val="0"/>
         <w:color w:val="6B7280"/>
         <w:sz w:val="12"/>
       </w:rPr>
-      <w:t>NBHS SCIENCE DEPARTMENT  •  SCIENCE LITERACY &amp; LESSON INTERNALIZATION  •  OCTOBER 28, 2026</w:t>
+      <w:t>NBHS SCIENCE DEPARTMENT  •  USE WITH THE LESSON INTERNALIZATION TOOL AS NEEDED  •  OCTOBER 28, 2026</w:t>
     </w:r>
   </w:p>
 </w:ftr>

</xml_diff>

<commit_message>
Align Oct. 28 PD strategy-share materials
Update the PD deck, agenda, and quick planning sheet so teachers may share existing reading/article-analysis or writing strategies, discuss what works and any challenge, or choose a CUBS/CER move to try in an upcoming lesson.
</commit_message>
<xml_diff>
--- a/assets/plc/2026-10-28_PD_Science_Literacy_Reflection_and_Next_Steps.docx
+++ b/assets/plc/2026-10-28_PD_Science_Literacy_Reflection_and_Next_Steps.docx
@@ -38,7 +38,7 @@
                 <w:b/>
                 <w:i w:val="0"/>
                 <w:color w:val="F4B7BC"/>
-                <w:sz w:val="14"/>
+                <w:sz w:val="16"/>
               </w:rPr>
               <w:t>NEW BEDFORD HIGH SCHOOL  |  SCIENCE DEPARTMENT</w:t>
             </w:r>
@@ -68,7 +68,7 @@
                 <w:b w:val="0"/>
                 <w:i w:val="0"/>
                 <w:color w:val="FFFFFF"/>
-                <w:sz w:val="16"/>
+                <w:sz w:val="18"/>
               </w:rPr>
               <w:t>Wednesday, October 28, 2026  •  2:30–3:30 p.m.</w:t>
             </w:r>
@@ -118,9 +118,9 @@
                 <w:b/>
                 <w:i w:val="0"/>
                 <w:color w:val="1F2933"/>
-                <w:sz w:val="16"/>
+                <w:sz w:val="18"/>
               </w:rPr>
-              <w:t>Teacher / Team:  ________________________</w:t>
+              <w:t>Teacher / Team:  ________________</w:t>
             </w:r>
           </w:p>
         </w:tc>
@@ -148,7 +148,7 @@
                 <w:b/>
                 <w:i w:val="0"/>
                 <w:color w:val="1F2933"/>
-                <w:sz w:val="16"/>
+                <w:sz w:val="18"/>
               </w:rPr>
               <w:t>Course:  ___________________</w:t>
             </w:r>
@@ -178,7 +178,7 @@
                 <w:b/>
                 <w:i w:val="0"/>
                 <w:color w:val="1F2933"/>
-                <w:sz w:val="16"/>
+                <w:sz w:val="18"/>
               </w:rPr>
               <w:t>Unit / Lesson:  _______________________</w:t>
             </w:r>
@@ -201,9 +201,9 @@
           <w:b/>
           <w:i w:val="0"/>
           <w:color w:val="B31B34"/>
-          <w:sz w:val="15"/>
+          <w:sz w:val="18"/>
         </w:rPr>
-        <w:t xml:space="preserve">USE THIS PAGE TO CAPTURE ONE IDEA YOU WILL TRY. </w:t>
+        <w:t xml:space="preserve">FOLLOW THE SAME SEQUENCE AS THE PD SLIDES. </w:t>
       </w:r>
       <w:r>
         <w:rPr>
@@ -211,9 +211,9 @@
           <w:b w:val="0"/>
           <w:i w:val="0"/>
           <w:color w:val="1F2933"/>
-          <w:sz w:val="16"/>
+          <w:sz w:val="18"/>
         </w:rPr>
-        <w:t>Short notes are enough; use open space for anything useful.</w:t>
+        <w:t>Short notes are enough; use the open space for anything useful.</w:t>
       </w:r>
     </w:p>
     <w:tbl>
@@ -251,7 +251,7 @@
                 <w:b/>
                 <w:i w:val="0"/>
                 <w:color w:val="B31B34"/>
-                <w:sz w:val="21"/>
+                <w:sz w:val="23"/>
               </w:rPr>
               <w:t xml:space="preserve">1  </w:t>
             </w:r>
@@ -261,16 +261,16 @@
                 <w:b/>
                 <w:i w:val="0"/>
                 <w:color w:val="1F2933"/>
-                <w:sz w:val="19"/>
+                <w:sz w:val="21"/>
               </w:rPr>
-              <w:t>MY SCIENCE SOURCE OR WRITING TASK</w:t>
+              <w:t>CUBS — SOURCE ANALYSIS</w:t>
             </w:r>
           </w:p>
         </w:tc>
       </w:tr>
       <w:tr>
         <w:trPr>
-          <w:trHeight w:val="1843" w:hRule="atLeast"/>
+          <w:trHeight w:val="1872" w:hRule="atLeast"/>
         </w:trPr>
         <w:tc>
           <w:tcPr>
@@ -296,9 +296,9 @@
                 <w:b w:val="0"/>
                 <w:i/>
                 <w:color w:val="6B7280"/>
-                <w:sz w:val="16"/>
+                <w:sz w:val="19"/>
               </w:rPr>
-              <w:t>What will students analyze, explain, or revise?</w:t>
+              <w:t>What will students circle, underline, box, and summarize or question in this source or task?</w:t>
             </w:r>
           </w:p>
         </w:tc>
@@ -344,7 +344,7 @@
                 <w:b/>
                 <w:i w:val="0"/>
                 <w:color w:val="B31B34"/>
-                <w:sz w:val="21"/>
+                <w:sz w:val="23"/>
               </w:rPr>
               <w:t xml:space="preserve">2  </w:t>
             </w:r>
@@ -354,16 +354,16 @@
                 <w:b/>
                 <w:i w:val="0"/>
                 <w:color w:val="1F2933"/>
-                <w:sz w:val="19"/>
+                <w:sz w:val="21"/>
               </w:rPr>
-              <w:t>MY STUDENT ROUTINE</w:t>
+              <w:t>COLOR-CODED CER — STUDENT RESPONSE</w:t>
             </w:r>
           </w:p>
         </w:tc>
       </w:tr>
       <w:tr>
         <w:trPr>
-          <w:trHeight w:val="2232" w:hRule="atLeast"/>
+          <w:trHeight w:val="1872" w:hRule="atLeast"/>
         </w:trPr>
         <w:tc>
           <w:tcPr>
@@ -381,22 +381,7 @@
           </w:tcPr>
           <w:p>
             <w:pPr>
-              <w:spacing w:before="0" w:after="80" w:line="240" w:lineRule="auto"/>
-            </w:pPr>
-            <w:r>
-              <w:rPr>
-                <w:rFonts w:ascii="Aptos" w:hAnsi="Aptos" w:eastAsia="Aptos"/>
-                <w:b/>
-                <w:i w:val="0"/>
-                <w:color w:val="1F2933"/>
-                <w:sz w:val="16"/>
-              </w:rPr>
-              <w:t>Check one or more:   ☐ CUBS source analysis     ☐ Color-coded CER     ☐ Feedback + revision</w:t>
-            </w:r>
-          </w:p>
-          <w:p>
-            <w:pPr>
-              <w:spacing w:before="0" w:after="0" w:line="240" w:lineRule="auto"/>
+              <w:spacing w:before="0" w:after="20" w:line="240" w:lineRule="auto"/>
             </w:pPr>
             <w:r>
               <w:rPr>
@@ -404,9 +389,9 @@
                 <w:b w:val="0"/>
                 <w:i/>
                 <w:color w:val="6B7280"/>
-                <w:sz w:val="16"/>
+                <w:sz w:val="19"/>
               </w:rPr>
-              <w:t>What will students do, say, or produce?</w:t>
+              <w:t>What should students make visible in the claim, evidence, and reasoning?</w:t>
             </w:r>
           </w:p>
         </w:tc>
@@ -452,7 +437,7 @@
                 <w:b/>
                 <w:i w:val="0"/>
                 <w:color w:val="B31B34"/>
-                <w:sz w:val="21"/>
+                <w:sz w:val="23"/>
               </w:rPr>
               <w:t xml:space="preserve">3  </w:t>
             </w:r>
@@ -462,16 +447,16 @@
                 <w:b/>
                 <w:i w:val="0"/>
                 <w:color w:val="1F2933"/>
-                <w:sz w:val="19"/>
+                <w:sz w:val="21"/>
               </w:rPr>
-              <w:t>ONE USEFUL IDEA FROM A COLLEAGUE</w:t>
+              <w:t>FEEDBACK + REVISION — STUDENT ACTION</w:t>
             </w:r>
           </w:p>
         </w:tc>
       </w:tr>
       <w:tr>
         <w:trPr>
-          <w:trHeight w:val="1756" w:hRule="atLeast"/>
+          <w:trHeight w:val="1872" w:hRule="atLeast"/>
         </w:trPr>
         <w:tc>
           <w:tcPr>
@@ -497,9 +482,9 @@
                 <w:b w:val="0"/>
                 <w:i/>
                 <w:color w:val="6B7280"/>
-                <w:sz w:val="16"/>
+                <w:sz w:val="19"/>
               </w:rPr>
-              <w:t>A strategy, sentence stem, question, or routine that could work in my course:</w:t>
+              <w:t>What feedback prompt will you use? What will students add, change, or clarify?</w:t>
             </w:r>
           </w:p>
         </w:tc>
@@ -545,7 +530,7 @@
                 <w:b/>
                 <w:i w:val="0"/>
                 <w:color w:val="B31B34"/>
-                <w:sz w:val="21"/>
+                <w:sz w:val="23"/>
               </w:rPr>
               <w:t xml:space="preserve">4  </w:t>
             </w:r>
@@ -555,16 +540,16 @@
                 <w:b/>
                 <w:i w:val="0"/>
                 <w:color w:val="1F2933"/>
-                <w:sz w:val="19"/>
+                <w:sz w:val="21"/>
               </w:rPr>
-              <w:t>MY NEXT STEP AND EVIDENCE CHECK</w:t>
+              <w:t>STRATEGY SHARE, NEXT STEP + FRIDAY EVIDENCE</w:t>
             </w:r>
           </w:p>
         </w:tc>
       </w:tr>
       <w:tr>
         <w:trPr>
-          <w:trHeight w:val="1987" w:hRule="atLeast"/>
+          <w:trHeight w:val="1872" w:hRule="atLeast"/>
         </w:trPr>
         <w:tc>
           <w:tcPr>
@@ -590,9 +575,9 @@
                 <w:b w:val="0"/>
                 <w:i/>
                 <w:color w:val="6B7280"/>
-                <w:sz w:val="16"/>
+                <w:sz w:val="19"/>
               </w:rPr>
-              <w:t>Before teaching, I will…  |  On Friday, I want to see or bring evidence of…</w:t>
+              <w:t>Share a strategy you use—or choose a CUBS/CER move to try next. What works/needs attention? What colleague idea will you borrow?</w:t>
             </w:r>
           </w:p>
         </w:tc>
@@ -623,7 +608,7 @@
         <w:b/>
         <w:i w:val="0"/>
         <w:color w:val="6B7280"/>
-        <w:sz w:val="12"/>
+        <w:sz w:val="14"/>
       </w:rPr>
       <w:t>NBHS SCIENCE DEPARTMENT  •  USE WITH THE LESSON INTERNALIZATION TOOL AS NEEDED  •  OCTOBER 28, 2026</w:t>
     </w:r>

</xml_diff>